<commit_message>
Updated Analysis.py and added comments
</commit_message>
<xml_diff>
--- a/docs/Generator_Overview.docx
+++ b/docs/Generator_Overview.docx
@@ -271,7 +271,7 @@
           <w:i/>
           <w:sz w:val="18"/>
         </w:rPr>
-        <w:t>Figure 1. How hard the classification problem is. A strong learner reaches ~94.8% accuracy, just under the Bayes-optimal ceiling (~95.3% test / 95.5% population); the paper’s reported 95.00% sits between them.</w:t>
+        <w:t>Figure 1. How hard the classification problem is. A basic MLP reaches ~95.2% accuracy — essentially the Bayes-optimal ceiling (~95.3% test / 95.5% population) — and brackets the paper’s reported 95.00%.</w:t>
       </w:r>
     </w:p>
     <w:p>
@@ -654,7 +654,39 @@
           </w:tcPr>
           <w:p>
             <w:r>
-              <w:t>Oracle ceiling 95.5%; strong learner 94.8% (target achievable)</w:t>
+              <w:t>Basic MLP 95.2%, at the oracle ceiling 95.5% (paper's 95% bracketed)</w:t>
+            </w:r>
+          </w:p>
+        </w:tc>
+      </w:tr>
+      <w:tr>
+        <w:tc>
+          <w:tcPr>
+            <w:tcW w:type="dxa" w:w="2880"/>
+          </w:tcPr>
+          <w:p>
+            <w:r>
+              <w:t>Defect-head weighted-F1</w:t>
+            </w:r>
+          </w:p>
+        </w:tc>
+        <w:tc>
+          <w:tcPr>
+            <w:tcW w:type="dxa" w:w="2880"/>
+          </w:tcPr>
+          <w:p>
+            <w:r>
+              <w:t>95.36% (reported)</w:t>
+            </w:r>
+          </w:p>
+        </w:tc>
+        <w:tc>
+          <w:tcPr>
+            <w:tcW w:type="dxa" w:w="2880"/>
+          </w:tcPr>
+          <w:p>
+            <w:r>
+              <w:t>Basic MLP 95.2%, oracle ceiling 95.2%</w:t>
             </w:r>
           </w:p>
         </w:tc>

</xml_diff>